<commit_message>
Unit 1.3 Lesson 6: two-page sub plan (instructions + answer key) as .docx; converter restarts list numbering
Co-Authored-By: Claude Opus 5.5 <noreply@anthropic.com>
Claude-Session: https://claude.ai/code/session_015XbTm62We1fpcnMNvSCXmZ
</commit_message>
<xml_diff>
--- a/assessments/HS-LS1-6/lessons/handouts/Lesson3_Sub_Plan.docx
+++ b/assessments/HS-LS1-6/lessons/handouts/Lesson3_Sub_Plan.docx
@@ -50,9 +50,12 @@
     </w:p>
     <w:p>
       <w:pPr>
-        <w:pStyle w:val="ListNumber"/>
-        <w:spacing w:after="60"/>
+        <w:spacing w:after="20"/>
+        <w:ind w:left="432" w:hanging="288"/>
       </w:pPr>
+      <w:r>
+        <w:t xml:space="preserve">1. </w:t>
+      </w:r>
       <w:r>
         <w:rPr>
           <w:b/>
@@ -68,9 +71,12 @@
     </w:p>
     <w:p>
       <w:pPr>
-        <w:pStyle w:val="ListNumber"/>
-        <w:spacing w:after="60"/>
+        <w:spacing w:after="20"/>
+        <w:ind w:left="432" w:hanging="288"/>
       </w:pPr>
+      <w:r>
+        <w:t xml:space="preserve">2. </w:t>
+      </w:r>
       <w:r>
         <w:rPr>
           <w:b/>
@@ -86,9 +92,12 @@
     </w:p>
     <w:p>
       <w:pPr>
-        <w:pStyle w:val="ListNumber"/>
-        <w:spacing w:after="60"/>
+        <w:spacing w:after="20"/>
+        <w:ind w:left="432" w:hanging="288"/>
       </w:pPr>
+      <w:r>
+        <w:t xml:space="preserve">3. </w:t>
+      </w:r>
       <w:r>
         <w:rPr>
           <w:b/>
@@ -116,9 +125,12 @@
     </w:p>
     <w:p>
       <w:pPr>
-        <w:pStyle w:val="ListNumber"/>
-        <w:spacing w:after="60"/>
+        <w:spacing w:after="20"/>
+        <w:ind w:left="432" w:hanging="288"/>
       </w:pPr>
+      <w:r>
+        <w:t xml:space="preserve">4. </w:t>
+      </w:r>
       <w:r>
         <w:rPr>
           <w:b/>
@@ -134,9 +146,12 @@
     </w:p>
     <w:p>
       <w:pPr>
-        <w:pStyle w:val="ListNumber"/>
-        <w:spacing w:after="60"/>
+        <w:spacing w:after="20"/>
+        <w:ind w:left="432" w:hanging="288"/>
       </w:pPr>
+      <w:r>
+        <w:t xml:space="preserve">5. </w:t>
+      </w:r>
       <w:r>
         <w:rPr>
           <w:b/>
@@ -1050,7 +1065,7 @@
     <w:pPr>
       <w:keepNext/>
       <w:keepLines/>
-      <w:spacing w:before="480" w:after="0"/>
+      <w:spacing w:before="0" w:after="40"/>
       <w:outlineLvl w:val="0"/>
     </w:pPr>
     <w:rPr>
@@ -1058,7 +1073,7 @@
       <w:b/>
       <w:bCs/>
       <w:color w:val="365F91" w:themeColor="accent1" w:themeShade="BF"/>
-      <w:sz w:val="28"/>
+      <w:sz w:val="30"/>
       <w:szCs w:val="28"/>
     </w:rPr>
   </w:style>
@@ -1074,7 +1089,7 @@
     <w:pPr>
       <w:keepNext/>
       <w:keepLines/>
-      <w:spacing w:before="200" w:after="0"/>
+      <w:spacing w:before="160" w:after="40"/>
       <w:outlineLvl w:val="1"/>
     </w:pPr>
     <w:rPr>
@@ -1082,7 +1097,7 @@
       <w:b/>
       <w:bCs/>
       <w:color w:val="4F81BD" w:themeColor="accent1"/>
-      <w:sz w:val="26"/>
+      <w:sz w:val="25"/>
       <w:szCs w:val="26"/>
     </w:rPr>
   </w:style>
@@ -1521,6 +1536,7 @@
       <w:numPr>
         <w:numId w:val="1"/>
       </w:numPr>
+      <w:spacing w:after="20"/>
       <w:contextualSpacing/>
     </w:pPr>
   </w:style>

</xml_diff>